<commit_message>
Adding cube user guide update documentation into repository
</commit_message>
<xml_diff>
--- a/2026/CUBE/Documentation/DEV_CUBE_UGU_001_v1.x.docx
+++ b/2026/CUBE/Documentation/DEV_CUBE_UGU_001_v1.x.docx
@@ -9949,23 +9949,7 @@
                 <w:sz w:val="20"/>
                 <w:szCs w:val="20"/>
               </w:rPr>
-              <w:t xml:space="preserve">The internal web application </w:t>
-            </w:r>
-            <w:proofErr w:type="gramStart"/>
-            <w:r>
-              <w:rPr>
-                <w:sz w:val="20"/>
-                <w:szCs w:val="20"/>
-              </w:rPr>
-              <w:t>used</w:t>
-            </w:r>
-            <w:proofErr w:type="gramEnd"/>
-            <w:r>
-              <w:rPr>
-                <w:sz w:val="20"/>
-                <w:szCs w:val="20"/>
-              </w:rPr>
-              <w:t xml:space="preserve"> to manage customers, service locations, operational resources, and reporting tools within the ZTERS platform.</w:t>
+              <w:t>The internal web application used to manage customers, service locations, operational resources, and reporting tools within the ZTERS platform.</w:t>
             </w:r>
           </w:p>
         </w:tc>
@@ -10175,23 +10159,7 @@
                 <w:sz w:val="20"/>
                 <w:szCs w:val="20"/>
               </w:rPr>
-              <w:t xml:space="preserve">An internal recognition system </w:t>
-            </w:r>
-            <w:proofErr w:type="gramStart"/>
-            <w:r>
-              <w:rPr>
-                <w:sz w:val="20"/>
-                <w:szCs w:val="20"/>
-              </w:rPr>
-              <w:t>used</w:t>
-            </w:r>
-            <w:proofErr w:type="gramEnd"/>
-            <w:r>
-              <w:rPr>
-                <w:sz w:val="20"/>
-                <w:szCs w:val="20"/>
-              </w:rPr>
-              <w:t xml:space="preserve"> to reward team members for achievements or contributions.</w:t>
+              <w:t>An internal recognition system used to reward team members for achievements or contributions.</w:t>
             </w:r>
           </w:p>
         </w:tc>
@@ -10429,21 +10397,12 @@
                 <w:szCs w:val="20"/>
               </w:rPr>
             </w:pPr>
-            <w:proofErr w:type="spellStart"/>
-            <w:r>
-              <w:rPr>
-                <w:sz w:val="20"/>
-                <w:szCs w:val="20"/>
-              </w:rPr>
-              <w:t>VM</w:t>
-            </w:r>
-            <w:proofErr w:type="spellEnd"/>
-            <w:r>
-              <w:rPr>
-                <w:sz w:val="20"/>
-                <w:szCs w:val="20"/>
-              </w:rPr>
-              <w:t xml:space="preserve"> </w:t>
+            <w:r>
+              <w:rPr>
+                <w:sz w:val="20"/>
+                <w:szCs w:val="20"/>
+              </w:rPr>
+              <w:t xml:space="preserve">VM </w:t>
             </w:r>
           </w:p>
         </w:tc>
@@ -11123,13 +11082,8 @@
       <w:pPr>
         <w:pStyle w:val="Heading4"/>
       </w:pPr>
-      <w:proofErr w:type="gramStart"/>
-      <w:r>
-        <w:t>Forgot</w:t>
-      </w:r>
-      <w:proofErr w:type="gramEnd"/>
-      <w:r>
-        <w:t xml:space="preserve"> Password</w:t>
+      <w:r>
+        <w:t>Forgot Password</w:t>
       </w:r>
     </w:p>
     <w:p>
@@ -11682,6 +11636,134 @@
     <w:p/>
     <w:p>
       <w:pPr>
+        <w:pStyle w:val="Heading3"/>
+      </w:pPr>
+      <w:r>
+        <w:t>Toilets</w:t>
+      </w:r>
+    </w:p>
+    <w:p>
+      <w:r>
+        <w:t>Manage portable toilet services, including standard units, specialty options, and servicing schedules.</w:t>
+      </w:r>
+    </w:p>
+    <w:p/>
+    <w:p>
+      <w:pPr>
+        <w:pStyle w:val="Heading3"/>
+      </w:pPr>
+      <w:r>
+        <w:t>Roll-offs</w:t>
+      </w:r>
+    </w:p>
+    <w:p>
+      <w:r>
+        <w:t>Handle temporary dumpster rentals for waste removal, typically used for construction and cleanup projects.</w:t>
+      </w:r>
+    </w:p>
+    <w:p/>
+    <w:p>
+      <w:pPr>
+        <w:pStyle w:val="Heading3"/>
+      </w:pPr>
+      <w:r>
+        <w:t>Containers</w:t>
+      </w:r>
+    </w:p>
+    <w:p>
+      <w:r>
+        <w:t>Manage storage container rentals for on-site storage needs, including delivery, pickup, and duration.</w:t>
+      </w:r>
+    </w:p>
+    <w:p/>
+    <w:p>
+      <w:pPr>
+        <w:pStyle w:val="Heading3"/>
+      </w:pPr>
+      <w:r>
+        <w:t>Fencing</w:t>
+      </w:r>
+    </w:p>
+    <w:p>
+      <w:r>
+        <w:t>Configure temporary fencing solutions for job sites, events, or restricted areas.</w:t>
+      </w:r>
+    </w:p>
+    <w:p/>
+    <w:p>
+      <w:pPr>
+        <w:pStyle w:val="Heading3"/>
+      </w:pPr>
+      <w:r>
+        <w:t>Front Loads</w:t>
+      </w:r>
+    </w:p>
+    <w:p>
+      <w:r>
+        <w:t>Manage scheduled waste collection services using front-load dumpsters for ongoing commercial use.</w:t>
+      </w:r>
+    </w:p>
+    <w:p/>
+    <w:p>
+      <w:pPr>
+        <w:pStyle w:val="Heading3"/>
+      </w:pPr>
+      <w:r>
+        <w:t>Equipment Rentals</w:t>
+      </w:r>
+    </w:p>
+    <w:p>
+      <w:r>
+        <w:t>Handle rentals of additional equipment such as machinery or support tools required for job sites.</w:t>
+      </w:r>
+    </w:p>
+    <w:p/>
+    <w:p>
+      <w:pPr>
+        <w:pStyle w:val="Heading3"/>
+      </w:pPr>
+      <w:r>
+        <w:t>Perm Roll-off</w:t>
+      </w:r>
+    </w:p>
+    <w:p>
+      <w:r>
+        <w:t>Manage permanent roll-off dumpster services for long-term or recurring waste management needs.</w:t>
+      </w:r>
+    </w:p>
+    <w:p/>
+    <w:p>
+      <w:pPr>
+        <w:pStyle w:val="Heading3"/>
+      </w:pPr>
+      <w:r>
+        <w:lastRenderedPageBreak/>
+        <w:t>Grease Trap</w:t>
+      </w:r>
+    </w:p>
+    <w:p>
+      <w:r>
+        <w:t>Handle grease trap cleaning and maintenance services, typically for restaurants and commercial kitchens.</w:t>
+      </w:r>
+    </w:p>
+    <w:p/>
+    <w:p>
+      <w:pPr>
+        <w:pStyle w:val="Heading3"/>
+      </w:pPr>
+      <w:r>
+        <w:t>Other Services</w:t>
+      </w:r>
+    </w:p>
+    <w:p>
+      <w:r>
+        <w:t>Capture and manage miscellaneous services that do not fall under standard product categories.</w:t>
+      </w:r>
+    </w:p>
+    <w:p/>
+    <w:p/>
+    <w:p>
+      <w:pPr>
         <w:pStyle w:val="Heading2"/>
       </w:pPr>
       <w:bookmarkStart w:id="26" w:name="_Toc225285122"/>
@@ -11766,7 +11848,6 @@
       </w:pPr>
       <w:bookmarkStart w:id="31" w:name="_Toc225285127"/>
       <w:r>
-        <w:lastRenderedPageBreak/>
         <w:t>Z Sight Monitors</w:t>
       </w:r>
       <w:bookmarkEnd w:id="31"/>
@@ -11783,6 +11864,7 @@
       </w:pPr>
       <w:bookmarkStart w:id="32" w:name="_Toc225285128"/>
       <w:r>
+        <w:lastRenderedPageBreak/>
         <w:t>Assets</w:t>
       </w:r>
       <w:bookmarkEnd w:id="32"/>
@@ -11973,13 +12055,8 @@
         <w:pStyle w:val="Heading2"/>
       </w:pPr>
       <w:bookmarkStart w:id="37" w:name="_Toc225285133"/>
-      <w:proofErr w:type="spellStart"/>
-      <w:r>
-        <w:t>VM</w:t>
-      </w:r>
-      <w:proofErr w:type="spellEnd"/>
-      <w:r>
-        <w:t xml:space="preserve"> Tickets</w:t>
+      <w:r>
+        <w:t>VM Tickets</w:t>
       </w:r>
       <w:bookmarkEnd w:id="37"/>
     </w:p>
@@ -12046,13 +12123,8 @@
         <w:pStyle w:val="Heading2"/>
       </w:pPr>
       <w:bookmarkStart w:id="41" w:name="_Toc225285137"/>
-      <w:proofErr w:type="spellStart"/>
-      <w:r>
-        <w:t>VM</w:t>
-      </w:r>
-      <w:proofErr w:type="spellEnd"/>
-      <w:r>
-        <w:t xml:space="preserve"> Activities</w:t>
+      <w:r>
+        <w:t>VM Activities</w:t>
       </w:r>
       <w:bookmarkEnd w:id="41"/>
     </w:p>
@@ -14143,7 +14215,6 @@
                 <w:szCs w:val="18"/>
               </w:rPr>
             </w:pPr>
-            <w:proofErr w:type="spellStart"/>
             <w:r>
               <w:rPr>
                 <w:b/>
@@ -14154,7 +14225,6 @@
               </w:rPr>
               <w:t>VM</w:t>
             </w:r>
-            <w:proofErr w:type="spellEnd"/>
           </w:p>
         </w:tc>
         <w:tc>
@@ -21171,23 +21241,13 @@
                 <w:szCs w:val="20"/>
               </w:rPr>
             </w:pPr>
-            <w:proofErr w:type="spellStart"/>
-            <w:r>
-              <w:rPr>
-                <w:rFonts w:cs="Arial"/>
-                <w:sz w:val="20"/>
-                <w:szCs w:val="20"/>
-              </w:rPr>
-              <w:t>VM</w:t>
-            </w:r>
-            <w:proofErr w:type="spellEnd"/>
-            <w:r>
-              <w:rPr>
-                <w:rFonts w:cs="Arial"/>
-                <w:sz w:val="20"/>
-                <w:szCs w:val="20"/>
-              </w:rPr>
-              <w:t xml:space="preserve"> Activities</w:t>
+            <w:r>
+              <w:rPr>
+                <w:rFonts w:cs="Arial"/>
+                <w:sz w:val="20"/>
+                <w:szCs w:val="20"/>
+              </w:rPr>
+              <w:t>VM Activities</w:t>
             </w:r>
           </w:p>
         </w:tc>
@@ -27925,21 +27985,12 @@
           <w:bCs/>
         </w:rPr>
       </w:pPr>
-      <w:proofErr w:type="gramStart"/>
       <w:r>
         <w:rPr>
           <w:b/>
           <w:bCs/>
         </w:rPr>
-        <w:t>Create</w:t>
-      </w:r>
-      <w:proofErr w:type="gramEnd"/>
-      <w:r>
-        <w:rPr>
-          <w:b/>
-          <w:bCs/>
-        </w:rPr>
-        <w:t xml:space="preserve"> a New Customer</w:t>
+        <w:t>Create a New Customer</w:t>
       </w:r>
     </w:p>
     <w:p>
@@ -28090,15 +28141,7 @@
       </w:pPr>
       <w:r>
         <w:lastRenderedPageBreak/>
-        <w:t xml:space="preserve">Locate the customer </w:t>
-      </w:r>
-      <w:proofErr w:type="gramStart"/>
-      <w:r>
-        <w:t>in</w:t>
-      </w:r>
-      <w:proofErr w:type="gramEnd"/>
-      <w:r>
-        <w:t xml:space="preserve"> the table.</w:t>
+        <w:t>Locate the customer in the table.</w:t>
       </w:r>
     </w:p>
     <w:p>
@@ -28482,7 +28525,13 @@
         <w:pStyle w:val="Heading4"/>
       </w:pPr>
       <w:r>
-        <w:t>Exceptions / Erro Handling</w:t>
+        <w:t>Exceptions / Erro</w:t>
+      </w:r>
+      <w:r>
+        <w:t>r</w:t>
+      </w:r>
+      <w:r>
+        <w:t xml:space="preserve"> Handling</w:t>
       </w:r>
     </w:p>
     <w:p>
@@ -28495,19 +28544,7 @@
           <w:rPr>
             <w:rStyle w:val="Hyperlink"/>
           </w:rPr>
-          <w:t>BookSt</w:t>
-        </w:r>
-        <w:r>
-          <w:rPr>
-            <w:rStyle w:val="Hyperlink"/>
-          </w:rPr>
-          <w:t>a</w:t>
-        </w:r>
-        <w:r>
-          <w:rPr>
-            <w:rStyle w:val="Hyperlink"/>
-          </w:rPr>
-          <w:t>ck</w:t>
+          <w:t>BookStack</w:t>
         </w:r>
         <w:proofErr w:type="spellEnd"/>
       </w:hyperlink>
@@ -28873,21 +28910,12 @@
           <w:bCs/>
         </w:rPr>
       </w:pPr>
-      <w:proofErr w:type="gramStart"/>
       <w:r>
         <w:rPr>
           <w:b/>
           <w:bCs/>
         </w:rPr>
-        <w:t>Create</w:t>
-      </w:r>
-      <w:proofErr w:type="gramEnd"/>
-      <w:r>
-        <w:rPr>
-          <w:b/>
-          <w:bCs/>
-        </w:rPr>
-        <w:t xml:space="preserve"> a New Site</w:t>
+        <w:t>Create a New Site</w:t>
       </w:r>
     </w:p>
     <w:p>
@@ -29037,15 +29065,7 @@
         </w:numPr>
       </w:pPr>
       <w:r>
-        <w:t xml:space="preserve">Locate the site </w:t>
-      </w:r>
-      <w:proofErr w:type="gramStart"/>
-      <w:r>
-        <w:t>in</w:t>
-      </w:r>
-      <w:proofErr w:type="gramEnd"/>
-      <w:r>
-        <w:t xml:space="preserve"> the table.</w:t>
+        <w:t>Locate the site in the table.</w:t>
       </w:r>
     </w:p>
     <w:p>
@@ -29396,15 +29416,7 @@
         </w:numPr>
       </w:pPr>
       <w:r>
-        <w:t xml:space="preserve">A new service site </w:t>
-      </w:r>
-      <w:proofErr w:type="gramStart"/>
-      <w:r>
-        <w:t>is</w:t>
-      </w:r>
-      <w:proofErr w:type="gramEnd"/>
-      <w:r>
-        <w:t xml:space="preserve"> created and linked to a customer.</w:t>
+        <w:t>A new service site is created and linked to a customer.</w:t>
       </w:r>
     </w:p>
     <w:p>
@@ -30446,12 +30458,21 @@
       </w:rPr>
       <w:t xml:space="preserve"> </w:t>
     </w:r>
+    <w:proofErr w:type="spellStart"/>
     <w:r>
       <w:rPr>
         <w:sz w:val="16"/>
         <w:szCs w:val="16"/>
       </w:rPr>
-      <w:t>Reportz Section</w:t>
+      <w:t>Reportz</w:t>
+    </w:r>
+    <w:proofErr w:type="spellEnd"/>
+    <w:r>
+      <w:rPr>
+        <w:sz w:val="16"/>
+        <w:szCs w:val="16"/>
+      </w:rPr>
+      <w:t xml:space="preserve"> Section</w:t>
     </w:r>
   </w:p>
   <w:p>
@@ -31393,12 +31414,21 @@
       </w:rPr>
       <w:t xml:space="preserve"> </w:t>
     </w:r>
+    <w:proofErr w:type="spellStart"/>
     <w:r>
       <w:rPr>
         <w:sz w:val="16"/>
         <w:szCs w:val="16"/>
       </w:rPr>
-      <w:t>Customerz Section</w:t>
+      <w:t>Customerz</w:t>
+    </w:r>
+    <w:proofErr w:type="spellEnd"/>
+    <w:r>
+      <w:rPr>
+        <w:sz w:val="16"/>
+        <w:szCs w:val="16"/>
+      </w:rPr>
+      <w:t xml:space="preserve"> Section</w:t>
     </w:r>
   </w:p>
   <w:p>
@@ -31625,12 +31655,21 @@
       </w:rPr>
       <w:t xml:space="preserve"> </w:t>
     </w:r>
+    <w:proofErr w:type="spellStart"/>
     <w:r>
       <w:rPr>
         <w:sz w:val="16"/>
         <w:szCs w:val="16"/>
       </w:rPr>
-      <w:t>Operationz Section</w:t>
+      <w:t>Operationz</w:t>
+    </w:r>
+    <w:proofErr w:type="spellEnd"/>
+    <w:r>
+      <w:rPr>
+        <w:sz w:val="16"/>
+        <w:szCs w:val="16"/>
+      </w:rPr>
+      <w:t xml:space="preserve"> Section</w:t>
     </w:r>
   </w:p>
   <w:p>
@@ -31741,12 +31780,21 @@
       </w:rPr>
       <w:t xml:space="preserve"> </w:t>
     </w:r>
+    <w:proofErr w:type="spellStart"/>
     <w:r>
       <w:rPr>
         <w:sz w:val="16"/>
         <w:szCs w:val="16"/>
       </w:rPr>
-      <w:t>Administratorz Section</w:t>
+      <w:t>Administratorz</w:t>
+    </w:r>
+    <w:proofErr w:type="spellEnd"/>
+    <w:r>
+      <w:rPr>
+        <w:sz w:val="16"/>
+        <w:szCs w:val="16"/>
+      </w:rPr>
+      <w:t xml:space="preserve"> Section</w:t>
     </w:r>
   </w:p>
   <w:p>
@@ -31857,12 +31905,21 @@
       </w:rPr>
       <w:t xml:space="preserve"> </w:t>
     </w:r>
+    <w:proofErr w:type="spellStart"/>
     <w:r>
       <w:rPr>
         <w:sz w:val="16"/>
         <w:szCs w:val="16"/>
       </w:rPr>
-      <w:t>Userz Section</w:t>
+      <w:t>Userz</w:t>
+    </w:r>
+    <w:proofErr w:type="spellEnd"/>
+    <w:r>
+      <w:rPr>
+        <w:sz w:val="16"/>
+        <w:szCs w:val="16"/>
+      </w:rPr>
+      <w:t xml:space="preserve"> Section</w:t>
     </w:r>
   </w:p>
   <w:p>
@@ -31973,12 +32030,21 @@
       </w:rPr>
       <w:t xml:space="preserve"> </w:t>
     </w:r>
+    <w:proofErr w:type="spellStart"/>
     <w:r>
       <w:rPr>
         <w:sz w:val="16"/>
         <w:szCs w:val="16"/>
       </w:rPr>
-      <w:t>Zeepz Section</w:t>
+      <w:t>Zeepz</w:t>
+    </w:r>
+    <w:proofErr w:type="spellEnd"/>
+    <w:r>
+      <w:rPr>
+        <w:sz w:val="16"/>
+        <w:szCs w:val="16"/>
+      </w:rPr>
+      <w:t xml:space="preserve"> Section</w:t>
     </w:r>
   </w:p>
   <w:p>

</xml_diff>